<commit_message>
Evaluation table, added 'cvičení 06'
</commit_message>
<xml_diff>
--- a/doc/PozadavkyPGRF1_Task1_2026.docx
+++ b/doc/PozadavkyPGRF1_Task1_2026.docx
@@ -764,8 +764,6 @@
                 <w:lang w:eastAsia="cs-CZ"/>
               </w:rPr>
             </w:pPr>
-            <w:bookmarkStart w:id="0" w:name="_GoBack"/>
-            <w:bookmarkEnd w:id="0"/>
           </w:p>
         </w:tc>
       </w:tr>
@@ -975,6 +973,8 @@
             </w:pPr>
           </w:p>
         </w:tc>
+        <w:bookmarkStart w:id="0" w:name="_GoBack"/>
+        <w:bookmarkEnd w:id="0"/>
       </w:tr>
       <w:tr>
         <w:trPr>
@@ -3468,6 +3468,14 @@
         <w:bCs/>
       </w:rPr>
       <w:t>, cvičení</w:t>
+    </w:r>
+    <w:r>
+      <w:rPr>
+        <w:rFonts w:ascii="Arial" w:hAnsi="Arial" w:cs="Arial"/>
+        <w:b/>
+        <w:bCs/>
+      </w:rPr>
+      <w:t xml:space="preserve"> 06</w:t>
     </w:r>
   </w:p>
   <w:p>

</xml_diff>

<commit_message>
Evaluation table, made github link functional
</commit_message>
<xml_diff>
--- a/doc/PozadavkyPGRF1_Task1_2026.docx
+++ b/doc/PozadavkyPGRF1_Task1_2026.docx
@@ -973,8 +973,6 @@
             </w:pPr>
           </w:p>
         </w:tc>
-        <w:bookmarkStart w:id="0" w:name="_GoBack"/>
-        <w:bookmarkEnd w:id="0"/>
       </w:tr>
       <w:tr>
         <w:trPr>
@@ -2201,15 +2199,29 @@
                 <w:lang w:eastAsia="cs-CZ"/>
               </w:rPr>
             </w:pPr>
-            <w:r>
-              <w:rPr>
-                <w:rFonts w:ascii="Times New Roman" w:eastAsia="Times New Roman" w:hAnsi="Times New Roman" w:cs="Times New Roman"/>
-                <w:sz w:val="20"/>
-                <w:szCs w:val="20"/>
-                <w:lang w:eastAsia="cs-CZ"/>
-              </w:rPr>
-              <w:t>https://github.com/Packalman/UHK-PGRF1-Ukol1</w:t>
-            </w:r>
+            <w:hyperlink r:id="rId6" w:history="1">
+              <w:r>
+                <w:rPr>
+                  <w:rStyle w:val="Hypertextovodkaz"/>
+                  <w:rFonts w:ascii="Times New Roman" w:eastAsia="Times New Roman" w:hAnsi="Times New Roman" w:cs="Times New Roman"/>
+                  <w:sz w:val="20"/>
+                  <w:szCs w:val="20"/>
+                  <w:lang w:eastAsia="cs-CZ"/>
+                </w:rPr>
+                <w:t>https://github.com/Packalman/UHK-PGRF1-Ukol1</w:t>
+              </w:r>
+            </w:hyperlink>
+            <w:r>
+              <w:rPr>
+                <w:rFonts w:ascii="Times New Roman" w:eastAsia="Times New Roman" w:hAnsi="Times New Roman" w:cs="Times New Roman"/>
+                <w:sz w:val="20"/>
+                <w:szCs w:val="20"/>
+                <w:lang w:eastAsia="cs-CZ"/>
+              </w:rPr>
+              <w:t xml:space="preserve"> </w:t>
+            </w:r>
+            <w:bookmarkStart w:id="0" w:name="_GoBack"/>
+            <w:bookmarkEnd w:id="0"/>
           </w:p>
         </w:tc>
       </w:tr>
@@ -3277,7 +3289,7 @@
       </w:pPr>
     </w:p>
     <w:sectPr>
-      <w:headerReference w:type="default" r:id="rId6"/>
+      <w:headerReference w:type="default" r:id="rId7"/>
       <w:pgSz w:w="16838" w:h="11906" w:orient="landscape"/>
       <w:pgMar w:top="567" w:right="720" w:bottom="426" w:left="720" w:header="708" w:footer="708" w:gutter="0"/>
       <w:cols w:space="708"/>
@@ -4094,6 +4106,17 @@
     <w:uiPriority w:val="99"/>
     <w:rsid w:val="002C0FFA"/>
   </w:style>
+  <w:style w:type="character" w:styleId="Hypertextovodkaz">
+    <w:name w:val="Hyperlink"/>
+    <w:basedOn w:val="Standardnpsmoodstavce"/>
+    <w:uiPriority w:val="99"/>
+    <w:unhideWhenUsed/>
+    <w:rsid w:val="00154B8C"/>
+    <w:rPr>
+      <w:color w:val="0563C1" w:themeColor="hyperlink"/>
+      <w:u w:val="single"/>
+    </w:rPr>
+  </w:style>
 </w:styles>
 </file>
 

</xml_diff>